<commit_message>
pagina productos y ruteo
</commit_message>
<xml_diff>
--- a/SRS-Gestion-Comercial.docx
+++ b/SRS-Gestion-Comercial.docx
@@ -652,7 +652,7 @@
         <w:rPr/>
         <w:t>El administrador podrá registrar, editar y eliminar productos.</w:t>
         <w:br/>
-        <w:t>Datos obligatorios para el registro: Nombre, Código, Precio de compra, Precio de venta, Categoría y Stock actual. (Los campos de descripción y stock mínimo serán opcionales).</w:t>
+        <w:t>Datos obligatorios para el registro: Nombre, Código, Precio de compra, Precio de venta y Stock actual. (Los campos de descripción y stock mínimo serán opcionales).</w:t>
       </w:r>
       <w:r>
         <w:rPr>
@@ -702,7 +702,15 @@
       </w:r>
       <w:r>
         <w:rPr/>
-        <w:t>Búsqueda de productos por nombre, con filtros por precio y categoría.</w:t>
+        <w:t xml:space="preserve">Búsqueda de productos por nombre, con filtros por precio y </w:t>
+      </w:r>
+      <w:r>
+        <w:rPr/>
+        <w:t>stock</w:t>
+      </w:r>
+      <w:r>
+        <w:rPr/>
+        <w:t>.</w:t>
       </w:r>
       <w:r>
         <w:rPr>
@@ -5534,24 +5542,25 @@
       <w:szCs w:val="16"/>
     </w:rPr>
   </w:style>
-  <w:style w:type="paragraph" w:styleId="List2">
+  <w:style w:type="paragraph" w:styleId="ListBullet3">
     <w:name w:val="List Bullet 3"/>
     <w:basedOn w:val="Normal"/>
     <w:uiPriority w:val="99"/>
     <w:unhideWhenUsed/>
+    <w:qFormat/>
     <w:rsid w:val="00326f90"/>
     <w:pPr>
       <w:spacing w:before="0" w:after="200"/>
-      <w:ind w:left="720" w:hanging="360"/>
       <w:contextualSpacing/>
     </w:pPr>
     <w:rPr/>
   </w:style>
-  <w:style w:type="paragraph" w:styleId="List3">
+  <w:style w:type="paragraph" w:styleId="ListBullet4">
     <w:name w:val="List Bullet 4"/>
     <w:basedOn w:val="Normal"/>
     <w:uiPriority w:val="99"/>
     <w:unhideWhenUsed/>
+    <w:qFormat/>
     <w:rsid w:val="00326f90"/>
     <w:pPr>
       <w:spacing w:before="0" w:after="200"/>
@@ -5575,19 +5584,6 @@
   </w:style>
   <w:style w:type="paragraph" w:styleId="ListBullet2">
     <w:name w:val="List Bullet 2"/>
-    <w:basedOn w:val="Normal"/>
-    <w:uiPriority w:val="99"/>
-    <w:unhideWhenUsed/>
-    <w:qFormat/>
-    <w:rsid w:val="00326f90"/>
-    <w:pPr>
-      <w:spacing w:before="0" w:after="200"/>
-      <w:contextualSpacing/>
-    </w:pPr>
-    <w:rPr/>
-  </w:style>
-  <w:style w:type="paragraph" w:styleId="ListBullet3">
-    <w:name w:val="List Bullet 3"/>
     <w:basedOn w:val="Normal"/>
     <w:uiPriority w:val="99"/>
     <w:unhideWhenUsed/>

</xml_diff>